<commit_message>
fix: prevent Supabase query overflows by implementing pagination and ID chunking for large datasets in dashboard routes and services
</commit_message>
<xml_diff>
--- a/docs/feature_guides/Repair-Options-User-Guide.docx
+++ b/docs/feature_guides/Repair-Options-User-Guide.docx
@@ -186,6 +186,76 @@
         </w:tc>
       </w:tr>
     </w:tbl>
+    <w:p>
+      <w:pPr>
+        <w:spacing w:after="60"/>
+      </w:pPr>
+      <w:r>
+        <w:t xml:space="preserve"/>
+      </w:r>
+    </w:p>
+    <w:p>
+      <w:pPr>
+        <w:spacing w:after="40" w:before="60"/>
+        <w:jc w:val="center"/>
+      </w:pPr>
+      <w:r>
+        <w:drawing>
+          <wp:inline distT="0" distB="0" distL="0" distR="0">
+            <wp:extent cx="5715000" cy="1190625"/>
+            <wp:effectExtent t="0" r="0" b="0" l="0"/>
+            <wp:docPr id="1" name="On the health check, a concern with options shows a &quot;2 OPTIONS (selected)&quot; badge and the chosen option’s price." descr="On the health check, a concern with options shows a &quot;2 OPTIONS (selected)&quot; badge and the chosen option’s price." title="On the health check, a concern with options shows a &quot;2 OPTIONS (selected)&quot; badge and the chosen option’s price."/>
+            <wp:cNvGraphicFramePr>
+              <a:graphicFrameLocks xmlns:a="http://schemas.openxmlformats.org/drawingml/2006/main" noChangeAspect="1"/>
+            </wp:cNvGraphicFramePr>
+            <a:graphic xmlns:a="http://schemas.openxmlformats.org/drawingml/2006/main">
+              <a:graphicData uri="http://schemas.openxmlformats.org/drawingml/2006/picture">
+                <pic:pic xmlns:pic="http://schemas.openxmlformats.org/drawingml/2006/picture">
+                  <pic:nvPicPr>
+                    <pic:cNvPr id="0" name="" descr=""/>
+                    <pic:cNvPicPr>
+                      <a:picLocks noChangeAspect="1" noChangeArrowheads="1"/>
+                    </pic:cNvPicPr>
+                  </pic:nvPicPr>
+                  <pic:blipFill>
+                    <a:blip r:embed="rId7" cstate="none"/>
+                    <a:srcRect/>
+                    <a:stretch>
+                      <a:fillRect/>
+                    </a:stretch>
+                  </pic:blipFill>
+                  <pic:spPr bwMode="auto">
+                    <a:xfrm>
+                      <a:off x="0" y="0"/>
+                      <a:ext cx="5715000" cy="1190625"/>
+                    </a:xfrm>
+                    <a:prstGeom prst="rect">
+                      <a:avLst/>
+                    </a:prstGeom>
+                  </pic:spPr>
+                </pic:pic>
+              </a:graphicData>
+            </a:graphic>
+          </wp:inline>
+        </w:drawing>
+      </w:r>
+    </w:p>
+    <w:p>
+      <w:pPr>
+        <w:spacing w:after="200"/>
+        <w:jc w:val="center"/>
+      </w:pPr>
+      <w:r>
+        <w:rPr>
+          <w:i/>
+          <w:iCs/>
+          <w:color w:val="4B5563"/>
+          <w:sz w:val="17"/>
+          <w:szCs w:val="17"/>
+        </w:rPr>
+        <w:t xml:space="preserve">On the health check, a concern with options shows a "2 OPTIONS (selected)" badge and the chosen option’s price.</w:t>
+      </w:r>
+    </w:p>
     <w:p>
       <w:pPr>
         <w:pStyle w:val="Heading1"/>
@@ -449,7 +519,7 @@
                 <w:sz w:val="21"/>
                 <w:szCs w:val="21"/>
               </w:rPr>
-              <w:t xml:space="preserve">A single job or fault on the health check, such as "Front brake pads worn". Sometimes called a repair item.</w:t>
+              <w:t xml:space="preserve">A single job or fault on the health check, such as "Rear Left Tyre". Sometimes called a repair item.</w:t>
             </w:r>
           </w:p>
         </w:tc>
@@ -507,7 +577,7 @@
                 <w:sz w:val="21"/>
                 <w:szCs w:val="21"/>
               </w:rPr>
-              <w:t xml:space="preserve">One priced way of fixing that concern, such as "Genuine Parts". A concern can have as many options as you need.</w:t>
+              <w:t xml:space="preserve">One priced way of fixing that concern, such as "Premium Tyre". A concern can have as many options as you need.</w:t>
             </w:r>
           </w:p>
         </w:tc>
@@ -565,7 +635,7 @@
                 <w:sz w:val="21"/>
                 <w:szCs w:val="21"/>
               </w:rPr>
-              <w:t xml:space="preserve">A label you can put on the option you’d suggest. It shows a green badge and becomes the customer’s default choice.</w:t>
+              <w:t xml:space="preserve">A label you can put on the option you’d suggest. It shows a badge and becomes the customer’s default choice.</w:t>
             </w:r>
           </w:p>
         </w:tc>
@@ -715,7 +785,7 @@
         <w:t xml:space="preserve">Name</w:t>
       </w:r>
       <w:r>
-        <w:t xml:space="preserve"> (required) — for example Genuine Parts, OE Quality, Standard or Budget</w:t>
+        <w:t xml:space="preserve"> (required) — for example Genuine Parts, OE Quality, Premium or Budget</w:t>
       </w:r>
     </w:p>
     <w:p>
@@ -763,7 +833,77 @@
         <w:spacing w:after="140" w:line="276"/>
       </w:pPr>
       <w:r>
-        <w:t xml:space="preserve">Repeat for each alternative you want to offer — for the brake example you’d add one for Genuine Parts and one for OE Quality.</w:t>
+        <w:t xml:space="preserve">Repeat for each alternative you want to offer.</w:t>
+      </w:r>
+    </w:p>
+    <w:p>
+      <w:pPr>
+        <w:spacing w:after="40"/>
+      </w:pPr>
+      <w:r>
+        <w:t xml:space="preserve"/>
+      </w:r>
+    </w:p>
+    <w:p>
+      <w:pPr>
+        <w:spacing w:after="40" w:before="60"/>
+        <w:jc w:val="center"/>
+      </w:pPr>
+      <w:r>
+        <w:drawing>
+          <wp:inline distT="0" distB="0" distL="0" distR="0">
+            <wp:extent cx="4762500" cy="3248025"/>
+            <wp:effectExtent t="0" r="0" b="0" l="0"/>
+            <wp:docPr id="1" name="The Manage Options window — here one concern is priced two ways, Budget (£80) and Premium (£140)." descr="The Manage Options window — here one concern is priced two ways, Budget (£80) and Premium (£140)." title="The Manage Options window — here one concern is priced two ways, Budget (£80) and Premium (£140)."/>
+            <wp:cNvGraphicFramePr>
+              <a:graphicFrameLocks xmlns:a="http://schemas.openxmlformats.org/drawingml/2006/main" noChangeAspect="1"/>
+            </wp:cNvGraphicFramePr>
+            <a:graphic xmlns:a="http://schemas.openxmlformats.org/drawingml/2006/main">
+              <a:graphicData uri="http://schemas.openxmlformats.org/drawingml/2006/picture">
+                <pic:pic xmlns:pic="http://schemas.openxmlformats.org/drawingml/2006/picture">
+                  <pic:nvPicPr>
+                    <pic:cNvPr id="0" name="" descr=""/>
+                    <pic:cNvPicPr>
+                      <a:picLocks noChangeAspect="1" noChangeArrowheads="1"/>
+                    </pic:cNvPicPr>
+                  </pic:nvPicPr>
+                  <pic:blipFill>
+                    <a:blip r:embed="rId8" cstate="none"/>
+                    <a:srcRect/>
+                    <a:stretch>
+                      <a:fillRect/>
+                    </a:stretch>
+                  </pic:blipFill>
+                  <pic:spPr bwMode="auto">
+                    <a:xfrm>
+                      <a:off x="0" y="0"/>
+                      <a:ext cx="4762500" cy="3248025"/>
+                    </a:xfrm>
+                    <a:prstGeom prst="rect">
+                      <a:avLst/>
+                    </a:prstGeom>
+                  </pic:spPr>
+                </pic:pic>
+              </a:graphicData>
+            </a:graphic>
+          </wp:inline>
+        </w:drawing>
+      </w:r>
+    </w:p>
+    <w:p>
+      <w:pPr>
+        <w:spacing w:after="200"/>
+        <w:jc w:val="center"/>
+      </w:pPr>
+      <w:r>
+        <w:rPr>
+          <w:i/>
+          <w:iCs/>
+          <w:color w:val="4B5563"/>
+          <w:sz w:val="17"/>
+          <w:szCs w:val="17"/>
+        </w:rPr>
+        <w:t xml:space="preserve">The Manage Options window — here one concern is priced two ways, Budget (£80) and Premium (£140).</w:t>
       </w:r>
     </w:p>
     <w:p>
@@ -790,7 +930,7 @@
         <w:t xml:space="preserve">Parts tab</w:t>
       </w:r>
       <w:r>
-        <w:t xml:space="preserve">, where every option appears as its own section. Put the right parts and labour under each one — for example, the same fitting time under both, but genuine pads under one and aftermarket pads under the other.</w:t>
+        <w:t xml:space="preserve">, where every option appears as its own section. Put the right parts and labour under each one.</w:t>
       </w:r>
     </w:p>
     <w:p>
@@ -919,6 +1059,68 @@
     </w:p>
     <w:p>
       <w:pPr>
+        <w:spacing w:after="40" w:before="60"/>
+        <w:jc w:val="center"/>
+      </w:pPr>
+      <w:r>
+        <w:drawing>
+          <wp:inline distT="0" distB="0" distL="0" distR="0">
+            <wp:extent cx="5334000" cy="2695575"/>
+            <wp:effectExtent t="0" r="0" b="0" l="0"/>
+            <wp:docPr id="1" name="In the portal the customer picks an option, then approves — the price updates to match their choice." descr="In the portal the customer picks an option, then approves — the price updates to match their choice." title="In the portal the customer picks an option, then approves — the price updates to match their choice."/>
+            <wp:cNvGraphicFramePr>
+              <a:graphicFrameLocks xmlns:a="http://schemas.openxmlformats.org/drawingml/2006/main" noChangeAspect="1"/>
+            </wp:cNvGraphicFramePr>
+            <a:graphic xmlns:a="http://schemas.openxmlformats.org/drawingml/2006/main">
+              <a:graphicData uri="http://schemas.openxmlformats.org/drawingml/2006/picture">
+                <pic:pic xmlns:pic="http://schemas.openxmlformats.org/drawingml/2006/picture">
+                  <pic:nvPicPr>
+                    <pic:cNvPr id="0" name="" descr=""/>
+                    <pic:cNvPicPr>
+                      <a:picLocks noChangeAspect="1" noChangeArrowheads="1"/>
+                    </pic:cNvPicPr>
+                  </pic:nvPicPr>
+                  <pic:blipFill>
+                    <a:blip r:embed="rId9" cstate="none"/>
+                    <a:srcRect/>
+                    <a:stretch>
+                      <a:fillRect/>
+                    </a:stretch>
+                  </pic:blipFill>
+                  <pic:spPr bwMode="auto">
+                    <a:xfrm>
+                      <a:off x="0" y="0"/>
+                      <a:ext cx="5334000" cy="2695575"/>
+                    </a:xfrm>
+                    <a:prstGeom prst="rect">
+                      <a:avLst/>
+                    </a:prstGeom>
+                  </pic:spPr>
+                </pic:pic>
+              </a:graphicData>
+            </a:graphic>
+          </wp:inline>
+        </w:drawing>
+      </w:r>
+    </w:p>
+    <w:p>
+      <w:pPr>
+        <w:spacing w:after="200"/>
+        <w:jc w:val="center"/>
+      </w:pPr>
+      <w:r>
+        <w:rPr>
+          <w:i/>
+          <w:iCs/>
+          <w:color w:val="4B5563"/>
+          <w:sz w:val="17"/>
+          <w:szCs w:val="17"/>
+        </w:rPr>
+        <w:t xml:space="preserve">In the portal the customer picks an option, then approves — the price updates to match their choice.</w:t>
+      </w:r>
+    </w:p>
+    <w:p>
+      <w:pPr>
         <w:pStyle w:val="ListParagraph"/>
         <w:numPr>
           <w:ilvl w:val="0"/>
@@ -989,7 +1191,7 @@
         <w:spacing w:after="120" w:line="272"/>
       </w:pPr>
       <w:r>
-        <w:t xml:space="preserve">Once approved, their choice is locked in and shown clearly, for example "Selected: Genuine Parts".</w:t>
+        <w:t xml:space="preserve">Once approved, their choice is locked in and shown clearly, for example "Selected: Premium Tyre".</w:t>
       </w:r>
     </w:p>
     <w:p>
@@ -1076,7 +1278,7 @@
         <w:spacing w:after="140" w:line="276"/>
       </w:pPr>
       <w:r>
-        <w:t xml:space="preserve">So the grand total is never misleading — it reflects the alternatives your customer actually chose. If they switch from Genuine Parts to OE Quality, the total updates straight away.</w:t>
+        <w:t xml:space="preserve">So the grand total is never misleading — it reflects the alternatives your customer actually chose. If they switch from Premium to Budget, the total updates straight away.</w:t>
       </w:r>
     </w:p>
     <w:p>
@@ -1098,7 +1300,7 @@
           <w:iCs/>
           <w:color w:val="4B5563"/>
         </w:rPr>
-        <w:t xml:space="preserve">Offering Genuine and OE Quality brake pads on one concern.</w:t>
+        <w:t xml:space="preserve">Offering a Premium and a Budget tyre on one concern.</w:t>
       </w:r>
     </w:p>
     <w:p>
@@ -1118,7 +1320,7 @@
           <w:b/>
           <w:bCs/>
         </w:rPr>
-        <w:t xml:space="preserve">"Front brake pads worn"</w:t>
+        <w:t xml:space="preserve">"Rear Left Tyre"</w:t>
       </w:r>
       <w:r>
         <w:t xml:space="preserve"> (red) on the health check. It becomes a concern.</w:t>
@@ -1151,10 +1353,10 @@
           <w:b/>
           <w:bCs/>
         </w:rPr>
-        <w:t xml:space="preserve">OE Quality</w:t>
-      </w:r>
-      <w:r>
-        <w:t xml:space="preserve"> — "Equivalent-quality aftermarket pads, 12-month warranty"</w:t>
+        <w:t xml:space="preserve">Budget Tyre</w:t>
+      </w:r>
+      <w:r>
+        <w:t xml:space="preserve"> — a quality budget tyre, fitted &amp; balanced</w:t>
       </w:r>
     </w:p>
     <w:p>
@@ -1171,10 +1373,10 @@
           <w:b/>
           <w:bCs/>
         </w:rPr>
-        <w:t xml:space="preserve">Genuine Parts</w:t>
-      </w:r>
-      <w:r>
-        <w:t xml:space="preserve"> — "Manufacturer OEM pads, 2-year warranty" — marked recommended</w:t>
+        <w:t xml:space="preserve">Premium Tyre</w:t>
+      </w:r>
+      <w:r>
+        <w:t xml:space="preserve"> — a premium branded tyre — marked recommended</w:t>
       </w:r>
     </w:p>
     <w:p>
@@ -1187,7 +1389,7 @@
         <w:spacing w:after="120" w:line="272"/>
       </w:pPr>
       <w:r>
-        <w:t xml:space="preserve">You add the labour and parts to each option. The totals work themselves out:</w:t>
+        <w:t xml:space="preserve">You add the parts to each option. The totals work themselves out:</w:t>
       </w:r>
     </w:p>
     <w:p>
@@ -1370,7 +1572,7 @@
                 <w:sz w:val="21"/>
                 <w:szCs w:val="21"/>
               </w:rPr>
-              <w:t xml:space="preserve">OE Quality</w:t>
+              <w:t xml:space="preserve">Budget Tyre</w:t>
             </w:r>
           </w:p>
         </w:tc>
@@ -1398,7 +1600,7 @@
                 <w:sz w:val="21"/>
                 <w:szCs w:val="21"/>
               </w:rPr>
-              <w:t xml:space="preserve">£127.50</w:t>
+              <w:t xml:space="preserve">£0.00</w:t>
             </w:r>
           </w:p>
         </w:tc>
@@ -1426,7 +1628,7 @@
                 <w:sz w:val="21"/>
                 <w:szCs w:val="21"/>
               </w:rPr>
-              <w:t xml:space="preserve">£35.00</w:t>
+              <w:t xml:space="preserve">£66.67</w:t>
             </w:r>
           </w:p>
         </w:tc>
@@ -1454,7 +1656,7 @@
                 <w:b/>
                 <w:bCs/>
               </w:rPr>
-              <w:t xml:space="preserve">£195.00</w:t>
+              <w:t xml:space="preserve">£80.00</w:t>
             </w:r>
           </w:p>
         </w:tc>
@@ -1480,7 +1682,7 @@
           </w:tcPr>
           <w:p>
             <w:r>
-              <w:t xml:space="preserve">Genuine Parts</w:t>
+              <w:t xml:space="preserve">Premium Tyre</w:t>
             </w:r>
             <w:r>
               <w:rPr>
@@ -1519,7 +1721,7 @@
                 <w:sz w:val="21"/>
                 <w:szCs w:val="21"/>
               </w:rPr>
-              <w:t xml:space="preserve">£127.50</w:t>
+              <w:t xml:space="preserve">£0.00</w:t>
             </w:r>
           </w:p>
         </w:tc>
@@ -1547,7 +1749,7 @@
                 <w:sz w:val="21"/>
                 <w:szCs w:val="21"/>
               </w:rPr>
-              <w:t xml:space="preserve">£55.00</w:t>
+              <w:t xml:space="preserve">£116.67</w:t>
             </w:r>
           </w:p>
         </w:tc>
@@ -1575,7 +1777,7 @@
                 <w:b/>
                 <w:bCs/>
               </w:rPr>
-              <w:t xml:space="preserve">£219.00</w:t>
+              <w:t xml:space="preserve">£140.00</w:t>
             </w:r>
           </w:p>
         </w:tc>
@@ -1599,7 +1801,7 @@
         <w:spacing w:after="120" w:line="272"/>
       </w:pPr>
       <w:r>
-        <w:t xml:space="preserve">You send the quote. In the portal the customer sees both choices, with Genuine Parts ticked first because it’s recommended.</w:t>
+        <w:t xml:space="preserve">You send the quote. In the portal the customer sees both choices, with Premium ticked first because it’s recommended.</w:t>
       </w:r>
     </w:p>
     <w:p>
@@ -1612,7 +1814,7 @@
         <w:spacing w:after="120" w:line="272"/>
       </w:pPr>
       <w:r>
-        <w:t xml:space="preserve">The customer prefers to save money, selects OE Quality and approves it.</w:t>
+        <w:t xml:space="preserve">The customer chooses Budget Tyre to save money, and approves it.</w:t>
       </w:r>
     </w:p>
     <w:p>
@@ -1625,17 +1827,17 @@
         <w:spacing w:after="120" w:line="272"/>
       </w:pPr>
       <w:r>
-        <w:t xml:space="preserve">The quote total updates to the OE Quality price (</w:t>
+        <w:t xml:space="preserve">The quote total updates to the Budget price (</w:t>
       </w:r>
       <w:r>
         <w:rPr>
           <w:b/>
           <w:bCs/>
         </w:rPr>
-        <w:t xml:space="preserve">£195.00</w:t>
-      </w:r>
-      <w:r>
-        <w:t xml:space="preserve">), and your screen shows the customer chose OE Quality. The line is locked as approved.</w:t>
+        <w:t xml:space="preserve">£80.00</w:t>
+      </w:r>
+      <w:r>
+        <w:t xml:space="preserve">), and your screen shows the customer chose Budget Tyre. The line is locked as approved.</w:t>
       </w:r>
     </w:p>
     <w:p>
@@ -1797,6 +1999,33 @@
         </w:tc>
       </w:tr>
     </w:tbl>
+    <w:p>
+      <w:pPr>
+        <w:spacing w:after="120"/>
+      </w:pPr>
+      <w:r>
+        <w:t xml:space="preserve"/>
+      </w:r>
+    </w:p>
+    <w:p>
+      <w:pPr>
+        <w:pBdr>
+          <w:top w:val="single" w:color="D8DBE0" w:sz="4" w:space="8"/>
+        </w:pBdr>
+        <w:spacing w:before="120"/>
+        <w:jc w:val="center"/>
+      </w:pPr>
+      <w:r>
+        <w:rPr>
+          <w:i/>
+          <w:iCs/>
+          <w:color w:val="9CA3AF"/>
+          <w:sz w:val="16"/>
+          <w:szCs w:val="16"/>
+        </w:rPr>
+        <w:t xml:space="preserve">Screens shown are illustrative recreations of the live app, using real example data.</w:t>
+      </w:r>
+    </w:p>
     <w:sectPr>
       <w:pgSz w:w="11906" w:h="16838" w:orient="portrait"/>
       <w:pgMar w:top="1440" w:right="1440" w:bottom="1440" w:left="1440" w:header="708" w:footer="708" w:gutter="0"/>

</xml_diff>